<commit_message>
docs: refresh TDD; add the ATE V&V one-pager
One-pager is an overview of the pipeline for ATE/QA/V&V audiences, in md, html
and pdf.
</commit_message>
<xml_diff>
--- a/docs/word/TDD.docx
+++ b/docs/word/TDD.docx
@@ -35,6 +35,20 @@
       </w:pPr>
       <w:r>
         <w:t xml:space="preserve">Technical Design Document — ATE / M1</w:t>
+      </w:r>
+    </w:p>
+    <w:p>
+      <w:pPr>
+        <w:pStyle w:val="BodyText"/>
+      </w:pPr>
+      <w:r>
+        <w:rPr>
+          <w:b/>
+        </w:rPr>
+        <w:t xml:space="preserve">Document version: </w:t>
+      </w:r>
+      <w:r>
+        <w:t>last updated 2026-07-13 against git commit 218c54a (“Eyal respin follow-up: slim repeated flow bodies; revert scale-number edits”). Re-stamp on every revision; the deliverable pipeline is at this repo state.</w:t>
       </w:r>
     </w:p>
     <w:p>
@@ -5196,6 +5210,652 @@
       </w:pPr>
       <w:r>
         <w:t>Delta detection is keyword-driven; an LLM-based classifier pass would catch deltas the keyword cues miss (e.g. "the device behaves as if X were true" without using "instead of"). Reserved for M3.</w:t>
+      </w:r>
+    </w:p>
+    <w:p>
+      <w:pPr>
+        <w:pStyle w:val="Heading2"/>
+      </w:pPr>
+      <w:r>
+        <w:t>11. Base + extension document model (Command Reference Guide ingest, 2026-07-13)</w:t>
+      </w:r>
+    </w:p>
+    <w:p>
+      <w:pPr>
+        <w:pStyle w:val="Heading3"/>
+      </w:pPr>
+      <w:r>
+        <w:t>Why</w:t>
+      </w:r>
+    </w:p>
+    <w:p>
+      <w:pPr>
+        <w:pStyle w:val="FirstParagraph"/>
+      </w:pPr>
+      <w:r>
+        <w:t>Section 9's open follow-up for M2 (“Replace cli_inheritance.BGP_NEIGHBOR_AF_L2VPN_EVPN with extracted commands from the real Exaware BGP CLI doc when available”) is now actionable. On 2026-07-13 Exaware shared references/EVPN/Command Reference Guide v8.X.0.pdf — the full-platform CLI reference (1577 pp). It reframes the input model from a single feature doc plus hand-curated guesses into a two-layer base + extension corpus.</w:t>
+      </w:r>
+    </w:p>
+    <w:p>
+      <w:pPr>
+        <w:pStyle w:val="Heading3"/>
+      </w:pPr>
+      <w:r>
+        <w:t>The two-layer input model</w:t>
+      </w:r>
+    </w:p>
+    <w:p>
+      <w:pPr>
+        <w:pStyle w:val="Compact"/>
+      </w:pPr>
+      <w:r>
+        <w:t>Base — Command Reference Guide (PDF). The full-platform CLI. Owns the authoritative grammar: syntax, value ranges, defaults, command modes and per-command SAFI applicability for the generic BGP-neighbor commands EVPN inherits (allow-as-in, capability, inbound-soft-reconfiguration, maximum-prefix, policy, private-as, route-reflector-client).</w:t>
+      </w:r>
+    </w:p>
+    <w:p>
+      <w:pPr>
+        <w:pStyle w:val="Compact"/>
+      </w:pPr>
+      <w:r>
+        <w:t>Extension — EVPN CLI 1.00.docx + EVPN System Specification 1.00.docx. The EVPN delta layered on the base. Owns EVPN scope and feature semantics: EVPN-specific commands, which base knobs the af-l2vpn evpn submode pulls in, and the RFC/behavioural MUSTs.</w:t>
+      </w:r>
+    </w:p>
+    <w:p>
+      <w:pPr>
+        <w:pStyle w:val="FirstParagraph"/>
+      </w:pPr>
+      <w:r>
+        <w:t>This replaces the hand-curated guesses in cli_inheritance.py (and the deinvent() coarsening that Eyal Ozeri's 2026-07-06 review forced) with doc-grounded values. The base grounds the how; the extension grounds the whether/why. A new base-CLI provenance (“CLI base — Command Reference Guide §X”) replaces cli-inherit, and cli_crosscheck moves these commands from the curated bucket to doc_grounded.</w:t>
+      </w:r>
+    </w:p>
+    <w:p>
+      <w:pPr>
+        <w:pStyle w:val="Heading3"/>
+      </w:pPr>
+      <w:r>
+        <w:t>Needed document structure (what the pipeline requires from each source)</w:t>
+      </w:r>
+    </w:p>
+    <w:p>
+      <w:pPr>
+        <w:pStyle w:val="FirstParagraph"/>
+      </w:pPr>
+      <w:r>
+        <w:t>For the base + extension merge to be machine-ingestible without AI, every command in both the base and the extension docs must keep the fixed command-table shape cli_extractor already parses. Exaware should preserve this structure in future revisions of the Command Reference Guide:</w:t>
+      </w:r>
+    </w:p>
+    <w:tbl>
+      <w:tblPr>
+        <w:tblW w:type="auto" w:w="0"/>
+        <w:tblLook w:firstColumn="1" w:firstRow="1" w:lastColumn="0" w:lastRow="0" w:noHBand="0" w:noVBand="1" w:val="04A0"/>
+      </w:tblPr>
+      <w:tblGrid>
+        <w:gridCol w:w="4680"/>
+        <w:gridCol w:w="4680"/>
+      </w:tblGrid>
+      <w:tr>
+        <w:tc>
+          <w:tcPr>
+            <w:tcW w:type="dxa" w:w="4680"/>
+          </w:tcPr>
+          <w:p>
+            <w:r/>
+            <w:r>
+              <w:rPr>
+                <w:b/>
+              </w:rPr>
+              <w:t>Table row label</w:t>
+            </w:r>
+          </w:p>
+        </w:tc>
+        <w:tc>
+          <w:tcPr>
+            <w:tcW w:type="dxa" w:w="4680"/>
+          </w:tcPr>
+          <w:p>
+            <w:r/>
+            <w:r>
+              <w:rPr>
+                <w:b/>
+              </w:rPr>
+              <w:t>Content the pipeline reads</w:t>
+            </w:r>
+          </w:p>
+        </w:tc>
+      </w:tr>
+      <w:tr>
+        <w:tc>
+          <w:tcPr>
+            <w:tcW w:type="dxa" w:w="4680"/>
+          </w:tcPr>
+          <w:p>
+            <w:r/>
+            <w:r>
+              <w:t>Description</w:t>
+            </w:r>
+          </w:p>
+        </w:tc>
+        <w:tc>
+          <w:tcPr>
+            <w:tcW w:type="dxa" w:w="4680"/>
+          </w:tcPr>
+          <w:p>
+            <w:r/>
+            <w:r>
+              <w:t>Purpose prose; default-behaviour phrases (“the default is …”).</w:t>
+            </w:r>
+          </w:p>
+        </w:tc>
+      </w:tr>
+      <w:tr>
+        <w:tc>
+          <w:tcPr>
+            <w:tcW w:type="dxa" w:w="4680"/>
+          </w:tcPr>
+          <w:p>
+            <w:r/>
+            <w:r>
+              <w:t>Command Syntax</w:t>
+            </w:r>
+          </w:p>
+        </w:tc>
+        <w:tc>
+          <w:tcPr>
+            <w:tcW w:type="dxa" w:w="4680"/>
+          </w:tcPr>
+          <w:p>
+            <w:r/>
+            <w:r>
+              <w:t>Command-line syntax including the no form; may be multi-line.</w:t>
+            </w:r>
+          </w:p>
+        </w:tc>
+      </w:tr>
+      <w:tr>
+        <w:tc>
+          <w:tcPr>
+            <w:tcW w:type="dxa" w:w="4680"/>
+          </w:tcPr>
+          <w:p>
+            <w:r/>
+            <w:r>
+              <w:t>Command Mode</w:t>
+            </w:r>
+          </w:p>
+        </w:tc>
+        <w:tc>
+          <w:tcPr>
+            <w:tcW w:type="dxa" w:w="4680"/>
+          </w:tcPr>
+          <w:p>
+            <w:r/>
+            <w:r>
+              <w:t>Mode hierarchy; may list several parents (e.g. neighbor afi safi AND neighbor-group afi safi — both must be kept).</w:t>
+            </w:r>
+          </w:p>
+        </w:tc>
+      </w:tr>
+      <w:tr>
+        <w:tc>
+          <w:tcPr>
+            <w:tcW w:type="dxa" w:w="4680"/>
+          </w:tcPr>
+          <w:p>
+            <w:r/>
+            <w:r>
+              <w:t>Parameters Table</w:t>
+            </w:r>
+          </w:p>
+        </w:tc>
+        <w:tc>
+          <w:tcPr>
+            <w:tcW w:type="dxa" w:w="4680"/>
+          </w:tcPr>
+          <w:p>
+            <w:r/>
+            <w:r>
+              <w:t>Header Name | Value | Description, then one row per parameter. Ranges as “1-10” / “0- 4294967295”; defaults as “(Default = X)”.</w:t>
+            </w:r>
+          </w:p>
+        </w:tc>
+      </w:tr>
+      <w:tr>
+        <w:tc>
+          <w:tcPr>
+            <w:tcW w:type="dxa" w:w="4680"/>
+          </w:tcPr>
+          <w:p>
+            <w:r/>
+            <w:r>
+              <w:t>Examples</w:t>
+            </w:r>
+          </w:p>
+        </w:tc>
+        <w:tc>
+          <w:tcPr>
+            <w:tcW w:type="dxa" w:w="4680"/>
+          </w:tcPr>
+          <w:p>
+            <w:r/>
+            <w:r>
+              <w:t>A CLI session illustrating the command.</w:t>
+            </w:r>
+          </w:p>
+        </w:tc>
+      </w:tr>
+      <w:tr>
+        <w:tc>
+          <w:tcPr>
+            <w:tcW w:type="dxa" w:w="4680"/>
+          </w:tcPr>
+          <w:p>
+            <w:r/>
+            <w:r>
+              <w:t>Notes</w:t>
+            </w:r>
+          </w:p>
+        </w:tc>
+        <w:tc>
+          <w:tcPr>
+            <w:tcW w:type="dxa" w:w="4680"/>
+          </w:tcPr>
+          <w:p>
+            <w:r/>
+            <w:r>
+              <w:t>Constraints, SAFI availability (“only available under unicast SAFI …”), mutex rules, prerequisites.</w:t>
+            </w:r>
+          </w:p>
+        </w:tc>
+      </w:tr>
+    </w:tbl>
+    <w:p>
+      <w:pPr>
+        <w:pStyle w:val="Compact"/>
+      </w:pPr>
+    </w:p>
+    <w:p>
+      <w:pPr>
+        <w:pStyle w:val="FirstParagraph"/>
+      </w:pPr>
+      <w:r>
+        <w:t>Structural requirements specific to the PDF base so it ingests cleanly:</w:t>
+      </w:r>
+    </w:p>
+    <w:p>
+      <w:pPr>
+        <w:pStyle w:val="Compact"/>
+      </w:pPr>
+      <w:r>
+        <w:t>The label column and value column must stay distinct table cells (the IR PDF path uses page.find_tables(); pdftotext -layout confirms the two-column split survives).</w:t>
+      </w:r>
+    </w:p>
+    <w:p>
+      <w:pPr>
+        <w:pStyle w:val="Compact"/>
+      </w:pPr>
+      <w:r>
+        <w:t>SAFI / submode applicability must appear in Notes or as an “options depend on submode” bullet. capability documents graceful-restart + orf only under the afi/safi submode — this is the exact signal the extension layer uses to decide EVPN applicability.</w:t>
+      </w:r>
+    </w:p>
+    <w:p>
+      <w:pPr>
+        <w:pStyle w:val="Compact"/>
+      </w:pPr>
+      <w:r>
+        <w:t>Command-mode cells must token-align so the base's generic “neighbor afi safi” maps onto the extension's “af-l2vpn evpn” submode.</w:t>
+      </w:r>
+    </w:p>
+    <w:p>
+      <w:pPr>
+        <w:pStyle w:val="Heading3"/>
+      </w:pPr>
+      <w:r>
+        <w:t>Cross result — base ↔ extension, 7 inherited knobs</w:t>
+      </w:r>
+    </w:p>
+    <w:p>
+      <w:pPr>
+        <w:pStyle w:val="FirstParagraph"/>
+      </w:pPr>
+      <w:r>
+        <w:t>All 7 hand-curated knobs are real commands in the base, and all 7 carried at least one invented element now corrected against the source. This vindicates the 2026-07-06 de-invention decision and lets the deliverable assert sourced grammar again:</w:t>
+      </w:r>
+    </w:p>
+    <w:tbl>
+      <w:tblPr>
+        <w:tblW w:type="auto" w:w="0"/>
+        <w:tblLook w:firstColumn="1" w:firstRow="1" w:lastColumn="0" w:lastRow="0" w:noHBand="0" w:noVBand="1" w:val="04A0"/>
+      </w:tblPr>
+      <w:tblGrid>
+        <w:gridCol w:w="3120"/>
+        <w:gridCol w:w="3120"/>
+        <w:gridCol w:w="3120"/>
+      </w:tblGrid>
+      <w:tr>
+        <w:tc>
+          <w:tcPr>
+            <w:tcW w:type="dxa" w:w="3120"/>
+          </w:tcPr>
+          <w:p>
+            <w:r/>
+            <w:r>
+              <w:rPr>
+                <w:b/>
+              </w:rPr>
+              <w:t>Knob</w:t>
+            </w:r>
+          </w:p>
+        </w:tc>
+        <w:tc>
+          <w:tcPr>
+            <w:tcW w:type="dxa" w:w="3120"/>
+          </w:tcPr>
+          <w:p>
+            <w:r/>
+            <w:r>
+              <w:rPr>
+                <w:b/>
+              </w:rPr>
+              <w:t>Base (Command Reference Guide) — authoritative</w:t>
+            </w:r>
+          </w:p>
+        </w:tc>
+        <w:tc>
+          <w:tcPr>
+            <w:tcW w:type="dxa" w:w="3120"/>
+          </w:tcPr>
+          <w:p>
+            <w:r/>
+            <w:r>
+              <w:rPr>
+                <w:b/>
+              </w:rPr>
+              <w:t>Was (hand-curated guess) — corrected</w:t>
+            </w:r>
+          </w:p>
+        </w:tc>
+      </w:tr>
+      <w:tr>
+        <w:tc>
+          <w:tcPr>
+            <w:tcW w:type="dxa" w:w="3120"/>
+          </w:tcPr>
+          <w:p>
+            <w:r/>
+            <w:r>
+              <w:t>allow-as-in</w:t>
+            </w:r>
+          </w:p>
+        </w:tc>
+        <w:tc>
+          <w:tcPr>
+            <w:tcW w:type="dxa" w:w="3120"/>
+          </w:tcPr>
+          <w:p>
+            <w:r/>
+            <w:r>
+              <w:t>allow-as-in number (1-10); Notes: only under unicast SAFI, VRF default, VPN SAFI</w:t>
+            </w:r>
+          </w:p>
+        </w:tc>
+        <w:tc>
+          <w:tcPr>
+            <w:tcW w:type="dxa" w:w="3120"/>
+          </w:tcPr>
+          <w:p>
+            <w:r/>
+            <w:r>
+              <w:t>[&lt;count&gt;] 1..10, default 3 (invented); EVPN applicability now in question</w:t>
+            </w:r>
+          </w:p>
+        </w:tc>
+      </w:tr>
+      <w:tr>
+        <w:tc>
+          <w:tcPr>
+            <w:tcW w:type="dxa" w:w="3120"/>
+          </w:tcPr>
+          <w:p>
+            <w:r/>
+            <w:r>
+              <w:t>capability</w:t>
+            </w:r>
+          </w:p>
+        </w:tc>
+        <w:tc>
+          <w:tcPr>
+            <w:tcW w:type="dxa" w:w="3120"/>
+          </w:tcPr>
+          <w:p>
+            <w:r/>
+            <w:r>
+              <w:t>options depend on submode; afi/safi submode → graceful-restart {enable|disable} and orf {both|disable|receive|send}</w:t>
+            </w:r>
+          </w:p>
+        </w:tc>
+        <w:tc>
+          <w:tcPr>
+            <w:tcW w:type="dxa" w:w="3120"/>
+          </w:tcPr>
+          <w:p>
+            <w:r/>
+            <w:r>
+              <w:t>orf-prefix-list send|receive|both | route-refresh (invented enumeration)</w:t>
+            </w:r>
+          </w:p>
+        </w:tc>
+      </w:tr>
+      <w:tr>
+        <w:tc>
+          <w:tcPr>
+            <w:tcW w:type="dxa" w:w="3120"/>
+          </w:tcPr>
+          <w:p>
+            <w:r/>
+            <w:r>
+              <w:t>inbound-soft-reconfiguration</w:t>
+            </w:r>
+          </w:p>
+        </w:tc>
+        <w:tc>
+          <w:tcPr>
+            <w:tcW w:type="dxa" w:w="3120"/>
+          </w:tcPr>
+          <w:p>
+            <w:r/>
+            <w:r>
+              <w:t>inbound-soft-reconfiguration [enable|disable]; default disable</w:t>
+            </w:r>
+          </w:p>
+        </w:tc>
+        <w:tc>
+          <w:tcPr>
+            <w:tcW w:type="dxa" w:w="3120"/>
+          </w:tcPr>
+          <w:p>
+            <w:r/>
+            <w:r>
+              <w:t>bare toggle (enable/disable argument missed)</w:t>
+            </w:r>
+          </w:p>
+        </w:tc>
+      </w:tr>
+      <w:tr>
+        <w:tc>
+          <w:tcPr>
+            <w:tcW w:type="dxa" w:w="3120"/>
+          </w:tcPr>
+          <w:p>
+            <w:r/>
+            <w:r>
+              <w:t>maximum-prefix</w:t>
+            </w:r>
+          </w:p>
+        </w:tc>
+        <w:tc>
+          <w:tcPr>
+            <w:tcW w:type="dxa" w:w="3120"/>
+          </w:tcPr>
+          <w:p>
+            <w:r/>
+            <w:r>
+              <w:t>maximum-prefix number &lt;max&gt; threshold &lt;percent&gt; action [warn|terminate]; max 0-4294967295 default 2097152, percent 1-100 default 75, action default warn</w:t>
+            </w:r>
+          </w:p>
+        </w:tc>
+        <w:tc>
+          <w:tcPr>
+            <w:tcW w:type="dxa" w:w="3120"/>
+          </w:tcPr>
+          <w:p>
+            <w:r/>
+            <w:r>
+              <w:t>&lt;max&gt; [&lt;pct&gt; [warning-only|restart &lt;interval&gt;]], default no limit (grammar and default invented)</w:t>
+            </w:r>
+          </w:p>
+        </w:tc>
+      </w:tr>
+      <w:tr>
+        <w:tc>
+          <w:tcPr>
+            <w:tcW w:type="dxa" w:w="3120"/>
+          </w:tcPr>
+          <w:p>
+            <w:r/>
+            <w:r>
+              <w:t>policy</w:t>
+            </w:r>
+          </w:p>
+        </w:tc>
+        <w:tc>
+          <w:tcPr>
+            <w:tcW w:type="dxa" w:w="3120"/>
+          </w:tcPr>
+          <w:p>
+            <w:r/>
+            <w:r>
+              <w:t>policy {in|out} policy-name (direction then name)</w:t>
+            </w:r>
+          </w:p>
+        </w:tc>
+        <w:tc>
+          <w:tcPr>
+            <w:tcW w:type="dxa" w:w="3120"/>
+          </w:tcPr>
+          <w:p>
+            <w:r/>
+            <w:r>
+              <w:t>policy &lt;policy-name&gt; {in|out} (argument order reversed)</w:t>
+            </w:r>
+          </w:p>
+        </w:tc>
+      </w:tr>
+      <w:tr>
+        <w:tc>
+          <w:tcPr>
+            <w:tcW w:type="dxa" w:w="3120"/>
+          </w:tcPr>
+          <w:p>
+            <w:r/>
+            <w:r>
+              <w:t>private-as</w:t>
+            </w:r>
+          </w:p>
+        </w:tc>
+        <w:tc>
+          <w:tcPr>
+            <w:tcW w:type="dxa" w:w="3120"/>
+          </w:tcPr>
+          <w:p>
+            <w:r/>
+            <w:r>
+              <w:t>private-as [remove|leave]; default leave</w:t>
+            </w:r>
+          </w:p>
+        </w:tc>
+        <w:tc>
+          <w:tcPr>
+            <w:tcW w:type="dxa" w:w="3120"/>
+          </w:tcPr>
+          <w:p>
+            <w:r/>
+            <w:r>
+              <w:t>private-as {remove|replace} (“replace” invented; real is “leave”)</w:t>
+            </w:r>
+          </w:p>
+        </w:tc>
+      </w:tr>
+      <w:tr>
+        <w:tc>
+          <w:tcPr>
+            <w:tcW w:type="dxa" w:w="3120"/>
+          </w:tcPr>
+          <w:p>
+            <w:r/>
+            <w:r>
+              <w:t>route-reflector-client</w:t>
+            </w:r>
+          </w:p>
+        </w:tc>
+        <w:tc>
+          <w:tcPr>
+            <w:tcW w:type="dxa" w:w="3120"/>
+          </w:tcPr>
+          <w:p>
+            <w:r/>
+            <w:r>
+              <w:t>route-reflector-client [enable|disable]; default disable</w:t>
+            </w:r>
+          </w:p>
+        </w:tc>
+        <w:tc>
+          <w:tcPr>
+            <w:tcW w:type="dxa" w:w="3120"/>
+          </w:tcPr>
+          <w:p>
+            <w:r/>
+            <w:r>
+              <w:t>bare toggle (enable/disable argument missed)</w:t>
+            </w:r>
+          </w:p>
+        </w:tc>
+      </w:tr>
+    </w:tbl>
+    <w:p>
+      <w:pPr>
+        <w:pStyle w:val="Compact"/>
+      </w:pPr>
+    </w:p>
+    <w:p>
+      <w:pPr>
+        <w:pStyle w:val="Heading3"/>
+      </w:pPr>
+      <w:r>
+        <w:t>Open items</w:t>
+      </w:r>
+    </w:p>
+    <w:p>
+      <w:pPr>
+        <w:pStyle w:val="Compact"/>
+      </w:pPr>
+      <w:r>
+        <w:t>allow-as-in's Notes restrict it to unicast + VPN SAFI. Before we keep its af-l2vpn evpn row, the extension (EVPN CLI doc / SFS) or Eyal must confirm EVPN applicability — the base+extension cross turns this from an assumption into a sourced question.</w:t>
+      </w:r>
+    </w:p>
+    <w:p>
+      <w:pPr>
+        <w:pStyle w:val="Compact"/>
+      </w:pPr>
+      <w:r>
+        <w:t>Add a scoped PDF-section ingest path: the CRG is 1577 pp but only ~15 BGP-neighbor sections (10.2.1.x) are in scope. cli_extractor should accept a section allow-list rather than parsing the whole book.</w:t>
+      </w:r>
+    </w:p>
+    <w:p>
+      <w:pPr>
+        <w:pStyle w:val="Compact"/>
+      </w:pPr>
+      <w:r>
+        <w:t>Once extracted commands land, drop cli_inheritance.deinvent() — the base carries true grammar and needs no de-invention.</w:t>
       </w:r>
     </w:p>
     <w:p>

</xml_diff>